<commit_message>
Refine subagent operating model
</commit_message>
<xml_diff>
--- a/18_DOCX/CASE_TEMPLATE.docx
+++ b/18_DOCX/CASE_TEMPLATE.docx
@@ -5,9 +5,12 @@
     <w:p>
       <w:pPr>
         <w:pStyle w:val="Heading1"/>
-        <w:jc w:val="left"/>
       </w:pPr>
       <w:r>
+        <w:rPr>
+          <w:color w:val="4F81BD"/>
+          <w:sz w:val="32"/>
+        </w:rPr>
         <w:t>CASE-0000 - Situação, produto e problema central</w:t>
       </w:r>
     </w:p>
@@ -16,6 +19,10 @@
         <w:pStyle w:val="Heading2"/>
       </w:pPr>
       <w:r>
+        <w:rPr>
+          <w:color w:val="4F81BD"/>
+          <w:sz w:val="28"/>
+        </w:rPr>
         <w:t>Controle</w:t>
       </w:r>
     </w:p>
@@ -56,6 +63,10 @@
         <w:pStyle w:val="Heading2"/>
       </w:pPr>
       <w:r>
+        <w:rPr>
+          <w:color w:val="4F81BD"/>
+          <w:sz w:val="28"/>
+        </w:rPr>
         <w:t>Código</w:t>
       </w:r>
     </w:p>
@@ -69,6 +80,10 @@
         <w:pStyle w:val="Heading2"/>
       </w:pPr>
       <w:r>
+        <w:rPr>
+          <w:color w:val="4F81BD"/>
+          <w:sz w:val="28"/>
+        </w:rPr>
         <w:t>Produto ou categoria</w:t>
       </w:r>
     </w:p>
@@ -82,6 +97,10 @@
         <w:pStyle w:val="Heading2"/>
       </w:pPr>
       <w:r>
+        <w:rPr>
+          <w:color w:val="4F81BD"/>
+          <w:sz w:val="28"/>
+        </w:rPr>
         <w:t>Situação</w:t>
       </w:r>
     </w:p>
@@ -95,6 +114,10 @@
         <w:pStyle w:val="Heading2"/>
       </w:pPr>
       <w:r>
+        <w:rPr>
+          <w:color w:val="4F81BD"/>
+          <w:sz w:val="28"/>
+        </w:rPr>
         <w:t>Problema</w:t>
       </w:r>
     </w:p>
@@ -108,6 +131,10 @@
         <w:pStyle w:val="Heading2"/>
       </w:pPr>
       <w:r>
+        <w:rPr>
+          <w:color w:val="4F81BD"/>
+          <w:sz w:val="28"/>
+        </w:rPr>
         <w:t>Análise</w:t>
       </w:r>
     </w:p>
@@ -121,6 +148,10 @@
         <w:pStyle w:val="Heading2"/>
       </w:pPr>
       <w:r>
+        <w:rPr>
+          <w:color w:val="4F81BD"/>
+          <w:sz w:val="28"/>
+        </w:rPr>
         <w:t>Orientação ao corretor</w:t>
       </w:r>
     </w:p>
@@ -134,6 +165,10 @@
         <w:pStyle w:val="Heading2"/>
       </w:pPr>
       <w:r>
+        <w:rPr>
+          <w:color w:val="4F81BD"/>
+          <w:sz w:val="28"/>
+        </w:rPr>
         <w:t>Como explicar ao cliente brasileiro</w:t>
       </w:r>
     </w:p>
@@ -147,6 +182,61 @@
         <w:pStyle w:val="Heading2"/>
       </w:pPr>
       <w:r>
+        <w:rPr>
+          <w:color w:val="4F81BD"/>
+          <w:sz w:val="28"/>
+        </w:rPr>
+        <w:t>Próximo passo recomendado</w:t>
+      </w:r>
+    </w:p>
+    <w:p>
+      <w:r>
+        <w:t>Acao pratica para o corretor conduzir o caso sem prometer aceitacao, cobertura, valor, prazo, pagamento, imposto ou decisao da seguradora.</w:t>
+      </w:r>
+    </w:p>
+    <w:p>
+      <w:pPr>
+        <w:pStyle w:val="Heading2"/>
+      </w:pPr>
+      <w:r>
+        <w:rPr>
+          <w:color w:val="4F81BD"/>
+          <w:sz w:val="28"/>
+        </w:rPr>
+        <w:t>Limite comercial/compliance</w:t>
+      </w:r>
+    </w:p>
+    <w:p>
+      <w:r>
+        <w:t>Usar quando o caso tratar de aceitacao, recusa, sinistro, pagamento, exclusao, imposto, culpa, declaracao de saude, prazo, beneficiario ou alteracao contratual.</w:t>
+      </w:r>
+    </w:p>
+    <w:p>
+      <w:r>
+        <w:t>Texto-base:</w:t>
+      </w:r>
+    </w:p>
+    <w:p>
+      <w:pPr>
+        <w:pStyle w:val="NoSpacing"/>
+      </w:pPr>
+      <w:r>
+        <w:rPr>
+          <w:rFonts w:ascii="Courier New" w:hAnsi="Courier New"/>
+          <w:sz w:val="18"/>
+        </w:rPr>
+        <w:t>Este material e apoio de atendimento. A decisao final sobre aceitacao, cobertura, valor, prazo, pagamento, recusa ou imposto depende dos documentos oficiais, das condicoes do contrato, da situacao concreta e da analise da seguradora ou autoridade competente.</w:t>
+      </w:r>
+    </w:p>
+    <w:p>
+      <w:pPr>
+        <w:pStyle w:val="Heading2"/>
+      </w:pPr>
+      <w:r>
+        <w:rPr>
+          <w:color w:val="4F81BD"/>
+          <w:sz w:val="28"/>
+        </w:rPr>
         <w:t>Resultado esperado</w:t>
       </w:r>
     </w:p>
@@ -160,6 +250,10 @@
         <w:pStyle w:val="Heading2"/>
       </w:pPr>
       <w:r>
+        <w:rPr>
+          <w:color w:val="4F81BD"/>
+          <w:sz w:val="28"/>
+        </w:rPr>
         <w:t>Termos relacionados</w:t>
       </w:r>
     </w:p>
@@ -176,6 +270,10 @@
         <w:pStyle w:val="Heading2"/>
       </w:pPr>
       <w:r>
+        <w:rPr>
+          <w:color w:val="4F81BD"/>
+          <w:sz w:val="28"/>
+        </w:rPr>
         <w:t>FAQs relacionadas</w:t>
       </w:r>
     </w:p>
@@ -192,6 +290,10 @@
         <w:pStyle w:val="Heading2"/>
       </w:pPr>
       <w:r>
+        <w:rPr>
+          <w:color w:val="4F81BD"/>
+          <w:sz w:val="28"/>
+        </w:rPr>
         <w:t>Diálogos relacionados</w:t>
       </w:r>
     </w:p>
@@ -208,6 +310,10 @@
         <w:pStyle w:val="Heading2"/>
       </w:pPr>
       <w:r>
+        <w:rPr>
+          <w:color w:val="4F81BD"/>
+          <w:sz w:val="28"/>
+        </w:rPr>
         <w:t>Referências cruzadas</w:t>
       </w:r>
     </w:p>
@@ -240,6 +346,10 @@
         <w:pStyle w:val="Heading2"/>
       </w:pPr>
       <w:r>
+        <w:rPr>
+          <w:color w:val="4F81BD"/>
+          <w:sz w:val="28"/>
+        </w:rPr>
         <w:t>Referências</w:t>
       </w:r>
     </w:p>
@@ -264,6 +374,10 @@
         <w:pStyle w:val="Heading2"/>
       </w:pPr>
       <w:r>
+        <w:rPr>
+          <w:color w:val="4F81BD"/>
+          <w:sz w:val="28"/>
+        </w:rPr>
         <w:t>Tags</w:t>
       </w:r>
     </w:p>
@@ -288,6 +402,10 @@
         <w:pStyle w:val="Heading2"/>
       </w:pPr>
       <w:r>
+        <w:rPr>
+          <w:color w:val="4F81BD"/>
+          <w:sz w:val="28"/>
+        </w:rPr>
         <w:t>Veja também</w:t>
       </w:r>
     </w:p>
@@ -296,7 +414,7 @@
         <w:pStyle w:val="ListBullet"/>
       </w:pPr>
       <w:r>
-        <w:t>`02_MasterDictionary/TERM_TEMPLATE.md`</w:t>
+        <w:t>02_MasterDictionary/TERM_TEMPLATE.md</w:t>
       </w:r>
     </w:p>
     <w:p>
@@ -304,7 +422,7 @@
         <w:pStyle w:val="ListBullet"/>
       </w:pPr>
       <w:r>
-        <w:t>`13_Dialogues/DIALOGUE_TEMPLATE.md`</w:t>
+        <w:t>13_Dialogues/DIALOGUE_TEMPLATE.md</w:t>
       </w:r>
     </w:p>
     <w:p>
@@ -312,7 +430,7 @@
         <w:pStyle w:val="ListBullet"/>
       </w:pPr>
       <w:r>
-        <w:t>`14_FAQ/FAQ_TEMPLATE.md`</w:t>
+        <w:t>14_FAQ/FAQ_TEMPLATE.md</w:t>
       </w:r>
     </w:p>
     <w:p>
@@ -320,6 +438,10 @@
         <w:pStyle w:val="Heading2"/>
       </w:pPr>
       <w:r>
+        <w:rPr>
+          <w:color w:val="4F81BD"/>
+          <w:sz w:val="28"/>
+        </w:rPr>
         <w:t>Histórico de revisão</w:t>
       </w:r>
     </w:p>
@@ -327,7 +449,7 @@
       <w:r>
         <w:rPr>
           <w:rFonts w:ascii="Courier New" w:hAnsi="Courier New"/>
-          <w:sz w:val="17"/>
+          <w:sz w:val="16"/>
         </w:rPr>
         <w:t>| Data | Versão | Autor | Alteração |</w:t>
       </w:r>
@@ -336,7 +458,7 @@
       <w:r>
         <w:rPr>
           <w:rFonts w:ascii="Courier New" w:hAnsi="Courier New"/>
-          <w:sz w:val="17"/>
+          <w:sz w:val="16"/>
         </w:rPr>
         <w:t>| --- | --- | --- | --- |</w:t>
       </w:r>
@@ -345,14 +467,14 @@
       <w:r>
         <w:rPr>
           <w:rFonts w:ascii="Courier New" w:hAnsi="Courier New"/>
-          <w:sz w:val="17"/>
+          <w:sz w:val="16"/>
         </w:rPr>
         <w:t>| AAAA-MM-DD | 0.1 |  | Criação inicial. |</w:t>
       </w:r>
     </w:p>
     <w:sectPr>
       <w:pgSz w:w="12240" w:h="15840"/>
-      <w:pgMar w:top="1080" w:right="1224" w:bottom="1080" w:left="1224" w:header="720" w:footer="720" w:gutter="0"/>
+      <w:pgMar w:top="1440" w:right="1440" w:bottom="1440" w:left="1440" w:header="720" w:footer="720" w:gutter="0"/>
       <w:cols w:space="720"/>
       <w:docGrid w:linePitch="360"/>
     </w:sectPr>
@@ -725,7 +847,7 @@
     <w:rsid w:val="00FC693F"/>
     <w:rPr>
       <w:rFonts w:ascii="Arial" w:hAnsi="Arial"/>
-      <w:sz w:val="21"/>
+      <w:sz w:val="22"/>
     </w:rPr>
   </w:style>
   <w:style w:type="paragraph" w:styleId="Header">

</xml_diff>